<commit_message>
Score Exponencial — metodologia v1.0.4 registrada (especificação operacional aprovada; Molodovsky com distribuição observada) e motor, etapa 3: notas no setor, pilares, peso do momentum e Score mensal
Co-Authored-By: Claude Opus 5.5 <noreply@anthropic.com>
Claude-Session: https://claude.ai/code/session_01HefRF4fGJRzRQKWSK6E8Hc
</commit_message>
<xml_diff>
--- a/docs/Score_Exponencial_especificacao_v1.0.4.docx
+++ b/docs/Score_Exponencial_especificacao_v1.0.4.docx
@@ -90,7 +90,7 @@
           <w:sz w:val="24"/>
           <w:szCs w:val="24"/>
         </w:rPr>
-        <w:t xml:space="preserve">Proposta de versão 1.0.4 — para aprovação</w:t>
+        <w:t xml:space="preserve">Versão 1.0.4 — aprovada em 22 de outubro de 2026</w:t>
       </w:r>
     </w:p>
     <w:p>
@@ -176,7 +176,7 @@
         <w:jc w:val="both"/>
       </w:pPr>
       <w:r>
-        <w:t xml:space="preserve">Tudo aqui fica congelado antes do primeiro teste. Depois de aprovado, vira a versão 1.0.4. Nenhum teste de desempenho foi rodado: as conferências abaixo só verificam se as contas estão certas.</w:t>
+        <w:t xml:space="preserve">Tudo aqui fica congelado antes do primeiro teste. Este documento faz parte da metodologia v1.0.4. Nenhum teste de desempenho foi rodado: as conferências abaixo só verificam se as contas estão certas.</w:t>
       </w:r>
     </w:p>
     <w:p>
@@ -186,7 +186,7 @@
         <w:keepLines/>
       </w:pPr>
       <w:r>
-        <w:t xml:space="preserve">Decisões para aprovar</w:t>
+        <w:t xml:space="preserve">Decisões aprovadas em 22/10/2026</w:t>
       </w:r>
     </w:p>
     <w:p>
@@ -195,7 +195,7 @@
         <w:jc w:val="both"/>
       </w:pPr>
       <w:r>
-        <w:t xml:space="preserve">Quase tudo é detalhe de cálculo, sem escolha de mérito. Oito pontos pedem a sua decisão:</w:t>
+        <w:t xml:space="preserve">Quase tudo é detalhe de cálculo, sem escolha de mérito. Oito pontos foram decididos pelo Dr. Thiago Viegas:</w:t>
       </w:r>
     </w:p>
     <w:p>
@@ -216,7 +216,7 @@
         <w:t xml:space="preserve">Crescimento implícito (Molodovsky) — variante B.</w:t>
       </w:r>
       <w:r>
-        <w:t xml:space="preserve"> Na fórmula registrada, o dividendo cai quando o crescimento sobe: D = E · (1 − g/R). Em 55% dos casos a rentabilidade R fica abaixo da taxa exigida k. Aí crescer destrói valor, e o crescimento implícito vai para o teto de 60% em 55% dos casos: o subitem perde a capacidade de separar as ações. Proposta: nas fases 1 e 2, usar a distribuição observada da empresa, D = p · E. No teto, ficam só 1% dos casos.</w:t>
+        <w:t xml:space="preserve"> Na fórmula registrada, o dividendo cai quando o crescimento sobe: D = E · (1 − g/R). Em 55% dos casos a rentabilidade R fica abaixo da taxa exigida k. Aí crescer destrói valor, e o crescimento implícito vai para o teto de 60% em 55% dos casos: o subitem perde a capacidade de separar as ações. Decisão: nas fases 1 e 2, usar a distribuição observada da empresa, D = p · E. No teto, ficam só 1% dos casos.</w:t>
       </w:r>
     </w:p>
     <w:p>
@@ -279,7 +279,7 @@
         <w:t xml:space="preserve">Reapresentações:</w:t>
       </w:r>
       <w:r>
-        <w:t xml:space="preserve"> os dados abertos da CVM guardam só a última versão de cada documento. Proposta: manter a regra registrada, em que a versão guardada só vale a partir da própria entrega. Aceitar a versão nova desde a primeira entrega aumentaria a cobertura em só 1,0 ponto percentual e traria risco de usar números corrigidos antes da hora (como nos casos de fraude).</w:t>
+        <w:t xml:space="preserve"> os dados abertos da CVM guardam só a última versão de cada documento. Decisão: manter a regra registrada, em que a versão guardada só vale a partir da própria entrega. Aceitar a versão nova desde a primeira entrega aumentaria a cobertura em só 1,0 ponto percentual e traria risco de usar números corrigidos antes da hora (como nos casos de fraude).</w:t>
       </w:r>
     </w:p>
     <w:p>
@@ -3983,28 +3983,7 @@
           <w:sz w:val="20"/>
           <w:szCs w:val="20"/>
         </w:rPr>
-        <w:t xml:space="preserve">entre ações parecidas, as menos negociadas tendem a estar no começo do ciclo do momentum.</w:t>
-      </w:r>
-    </w:p>
-    <w:p>
-      <w:pPr>
-        <w:pStyle w:val="ListParagraph"/>
-        <w:numPr>
-          <w:ilvl w:val="0"/>
-          <w:numId w:val="3"/>
-        </w:numPr>
-        <w:spacing w:after="60" w:line="280"/>
-        <w:jc w:val="both"/>
-      </w:pPr>
-      <w:r>
-        <w:rPr>
-          <w:b/>
-          <w:bCs/>
-        </w:rPr>
-        <w:t xml:space="preserve">Dado:</w:t>
-      </w:r>
-      <w:r>
-        <w:t xml:space="preserve"> de 2010 em diante (quantidade de ações da CVM).</w:t>
+        <w:t xml:space="preserve">entre ações parecidas, as menos negociadas tendem a estar no começo do ciclo do momentum. Há dado de 2010 em diante.</w:t>
       </w:r>
     </w:p>
     <w:p>
@@ -5469,7 +5448,7 @@
           <w:sz w:val="20"/>
           <w:szCs w:val="20"/>
         </w:rPr>
-        <w:t xml:space="preserve">na proposta, o dividendo </w:t>
+        <w:t xml:space="preserve">o dividendo </w:t>
       </w:r>
       <w:r>
         <w:rPr>
@@ -7717,7 +7696,7 @@
         <w:keepLines/>
       </w:pPr>
       <w:r>
-        <w:t xml:space="preserve">20. Concordância entre pilares (proposta)</w:t>
+        <w:t xml:space="preserve">20. Concordância entre pilares</w:t>
       </w:r>
     </w:p>
     <w:p>
@@ -12402,7 +12381,7 @@
           </w:tcPr>
           <w:p>
             <w:pPr>
-              <w:keepNext/>
+              <w:keepNext w:val="false"/>
             </w:pPr>
             <w:r>
               <w:rPr>
@@ -12431,7 +12410,7 @@
           </w:tcPr>
           <w:p>
             <w:pPr>
-              <w:keepNext/>
+              <w:keepNext w:val="false"/>
             </w:pPr>
             <w:r>
               <w:rPr>
@@ -12460,7 +12439,7 @@
           </w:tcPr>
           <w:p>
             <w:pPr>
-              <w:keepNext/>
+              <w:keepNext w:val="false"/>
             </w:pPr>
             <w:r>
               <w:rPr>
@@ -12489,7 +12468,7 @@
           </w:tcPr>
           <w:p>
             <w:pPr>
-              <w:keepNext/>
+              <w:keepNext w:val="false"/>
             </w:pPr>
             <w:r>
               <w:rPr>
@@ -12523,7 +12502,7 @@
           </w:tcPr>
           <w:p>
             <w:pPr>
-              <w:keepNext/>
+              <w:keepNext w:val="false"/>
             </w:pPr>
             <w:r>
               <w:rPr>
@@ -12552,7 +12531,7 @@
           </w:tcPr>
           <w:p>
             <w:pPr>
-              <w:keepNext/>
+              <w:keepNext w:val="false"/>
             </w:pPr>
             <w:r>
               <w:rPr>
@@ -12581,7 +12560,7 @@
           </w:tcPr>
           <w:p>
             <w:pPr>
-              <w:keepNext/>
+              <w:keepNext w:val="false"/>
             </w:pPr>
             <w:r>
               <w:rPr>
@@ -12610,7 +12589,7 @@
           </w:tcPr>
           <w:p>
             <w:pPr>
-              <w:keepNext/>
+              <w:keepNext w:val="false"/>
             </w:pPr>
             <w:r>
               <w:rPr>
@@ -12644,7 +12623,7 @@
           </w:tcPr>
           <w:p>
             <w:pPr>
-              <w:keepNext/>
+              <w:keepNext w:val="false"/>
             </w:pPr>
             <w:r>
               <w:rPr>
@@ -12673,7 +12652,7 @@
           </w:tcPr>
           <w:p>
             <w:pPr>
-              <w:keepNext/>
+              <w:keepNext w:val="false"/>
             </w:pPr>
             <w:r>
               <w:rPr>
@@ -12702,7 +12681,7 @@
           </w:tcPr>
           <w:p>
             <w:pPr>
-              <w:keepNext/>
+              <w:keepNext w:val="false"/>
             </w:pPr>
             <w:r>
               <w:rPr>
@@ -12731,7 +12710,7 @@
           </w:tcPr>
           <w:p>
             <w:pPr>
-              <w:keepNext/>
+              <w:keepNext w:val="false"/>
             </w:pPr>
             <w:r>
               <w:rPr>
@@ -12765,7 +12744,7 @@
           </w:tcPr>
           <w:p>
             <w:pPr>
-              <w:keepNext/>
+              <w:keepNext w:val="false"/>
             </w:pPr>
             <w:r>
               <w:rPr>
@@ -12794,7 +12773,7 @@
           </w:tcPr>
           <w:p>
             <w:pPr>
-              <w:keepNext/>
+              <w:keepNext w:val="false"/>
             </w:pPr>
             <w:r>
               <w:rPr>
@@ -12823,7 +12802,7 @@
           </w:tcPr>
           <w:p>
             <w:pPr>
-              <w:keepNext/>
+              <w:keepNext w:val="false"/>
             </w:pPr>
             <w:r>
               <w:rPr>
@@ -12852,7 +12831,7 @@
           </w:tcPr>
           <w:p>
             <w:pPr>
-              <w:keepNext/>
+              <w:keepNext w:val="false"/>
             </w:pPr>
             <w:r>
               <w:rPr>
@@ -12886,7 +12865,7 @@
           </w:tcPr>
           <w:p>
             <w:pPr>
-              <w:keepNext/>
+              <w:keepNext w:val="false"/>
             </w:pPr>
             <w:r>
               <w:rPr>
@@ -12915,7 +12894,7 @@
           </w:tcPr>
           <w:p>
             <w:pPr>
-              <w:keepNext/>
+              <w:keepNext w:val="false"/>
             </w:pPr>
             <w:r>
               <w:rPr>
@@ -12944,7 +12923,7 @@
           </w:tcPr>
           <w:p>
             <w:pPr>
-              <w:keepNext/>
+              <w:keepNext w:val="false"/>
             </w:pPr>
             <w:r>
               <w:rPr>
@@ -12973,7 +12952,7 @@
           </w:tcPr>
           <w:p>
             <w:pPr>
-              <w:keepNext/>
+              <w:keepNext w:val="false"/>
             </w:pPr>
             <w:r>
               <w:rPr>
@@ -13007,7 +12986,7 @@
           </w:tcPr>
           <w:p>
             <w:pPr>
-              <w:keepNext/>
+              <w:keepNext w:val="false"/>
             </w:pPr>
             <w:r>
               <w:rPr>
@@ -13036,7 +13015,7 @@
           </w:tcPr>
           <w:p>
             <w:pPr>
-              <w:keepNext/>
+              <w:keepNext w:val="false"/>
             </w:pPr>
             <w:r>
               <w:rPr>
@@ -13065,7 +13044,7 @@
           </w:tcPr>
           <w:p>
             <w:pPr>
-              <w:keepNext/>
+              <w:keepNext w:val="false"/>
             </w:pPr>
             <w:r>
               <w:rPr>
@@ -13094,7 +13073,7 @@
           </w:tcPr>
           <w:p>
             <w:pPr>
-              <w:keepNext/>
+              <w:keepNext w:val="false"/>
             </w:pPr>
             <w:r>
               <w:rPr>
@@ -13128,7 +13107,7 @@
           </w:tcPr>
           <w:p>
             <w:pPr>
-              <w:keepNext/>
+              <w:keepNext w:val="false"/>
             </w:pPr>
             <w:r>
               <w:rPr>
@@ -13157,7 +13136,7 @@
           </w:tcPr>
           <w:p>
             <w:pPr>
-              <w:keepNext/>
+              <w:keepNext w:val="false"/>
             </w:pPr>
             <w:r>
               <w:rPr>
@@ -13186,7 +13165,7 @@
           </w:tcPr>
           <w:p>
             <w:pPr>
-              <w:keepNext/>
+              <w:keepNext w:val="false"/>
             </w:pPr>
             <w:r>
               <w:rPr>
@@ -13215,7 +13194,7 @@
           </w:tcPr>
           <w:p>
             <w:pPr>
-              <w:keepNext/>
+              <w:keepNext w:val="false"/>
             </w:pPr>
             <w:r>
               <w:rPr>
@@ -13249,7 +13228,7 @@
           </w:tcPr>
           <w:p>
             <w:pPr>
-              <w:keepNext/>
+              <w:keepNext w:val="false"/>
             </w:pPr>
             <w:r>
               <w:rPr>
@@ -13278,7 +13257,7 @@
           </w:tcPr>
           <w:p>
             <w:pPr>
-              <w:keepNext/>
+              <w:keepNext w:val="false"/>
             </w:pPr>
             <w:r>
               <w:rPr>
@@ -13307,7 +13286,7 @@
           </w:tcPr>
           <w:p>
             <w:pPr>
-              <w:keepNext/>
+              <w:keepNext w:val="false"/>
             </w:pPr>
             <w:r>
               <w:rPr>
@@ -13336,7 +13315,7 @@
           </w:tcPr>
           <w:p>
             <w:pPr>
-              <w:keepNext/>
+              <w:keepNext w:val="false"/>
             </w:pPr>
             <w:r>
               <w:rPr>
@@ -13370,7 +13349,7 @@
           </w:tcPr>
           <w:p>
             <w:pPr>
-              <w:keepNext/>
+              <w:keepNext w:val="false"/>
             </w:pPr>
             <w:r>
               <w:rPr>
@@ -13399,7 +13378,7 @@
           </w:tcPr>
           <w:p>
             <w:pPr>
-              <w:keepNext/>
+              <w:keepNext w:val="false"/>
             </w:pPr>
             <w:r>
               <w:rPr>
@@ -13428,7 +13407,7 @@
           </w:tcPr>
           <w:p>
             <w:pPr>
-              <w:keepNext/>
+              <w:keepNext w:val="false"/>
             </w:pPr>
             <w:r>
               <w:rPr>
@@ -13457,7 +13436,7 @@
           </w:tcPr>
           <w:p>
             <w:pPr>
-              <w:keepNext/>
+              <w:keepNext w:val="false"/>
             </w:pPr>
             <w:r>
               <w:rPr>
@@ -13491,7 +13470,7 @@
           </w:tcPr>
           <w:p>
             <w:pPr>
-              <w:keepNext/>
+              <w:keepNext w:val="false"/>
             </w:pPr>
             <w:r>
               <w:rPr>
@@ -13520,7 +13499,7 @@
           </w:tcPr>
           <w:p>
             <w:pPr>
-              <w:keepNext/>
+              <w:keepNext w:val="false"/>
             </w:pPr>
             <w:r>
               <w:rPr>
@@ -13549,7 +13528,7 @@
           </w:tcPr>
           <w:p>
             <w:pPr>
-              <w:keepNext/>
+              <w:keepNext w:val="false"/>
             </w:pPr>
             <w:r>
               <w:rPr>
@@ -13578,7 +13557,7 @@
           </w:tcPr>
           <w:p>
             <w:pPr>
-              <w:keepNext/>
+              <w:keepNext w:val="false"/>
             </w:pPr>
             <w:r>
               <w:rPr>
@@ -13612,7 +13591,7 @@
           </w:tcPr>
           <w:p>
             <w:pPr>
-              <w:keepNext/>
+              <w:keepNext w:val="false"/>
             </w:pPr>
             <w:r>
               <w:rPr>
@@ -13641,7 +13620,7 @@
           </w:tcPr>
           <w:p>
             <w:pPr>
-              <w:keepNext/>
+              <w:keepNext w:val="false"/>
             </w:pPr>
             <w:r>
               <w:rPr>
@@ -13670,7 +13649,7 @@
           </w:tcPr>
           <w:p>
             <w:pPr>
-              <w:keepNext/>
+              <w:keepNext w:val="false"/>
             </w:pPr>
             <w:r>
               <w:rPr>
@@ -13699,7 +13678,7 @@
           </w:tcPr>
           <w:p>
             <w:pPr>
-              <w:keepNext/>
+              <w:keepNext w:val="false"/>
             </w:pPr>
             <w:r>
               <w:rPr>
@@ -13733,7 +13712,7 @@
           </w:tcPr>
           <w:p>
             <w:pPr>
-              <w:keepNext/>
+              <w:keepNext w:val="false"/>
             </w:pPr>
             <w:r>
               <w:rPr>
@@ -13762,7 +13741,7 @@
           </w:tcPr>
           <w:p>
             <w:pPr>
-              <w:keepNext/>
+              <w:keepNext w:val="false"/>
             </w:pPr>
             <w:r>
               <w:rPr>
@@ -13791,7 +13770,7 @@
           </w:tcPr>
           <w:p>
             <w:pPr>
-              <w:keepNext/>
+              <w:keepNext w:val="false"/>
             </w:pPr>
             <w:r>
               <w:rPr>
@@ -13820,7 +13799,7 @@
           </w:tcPr>
           <w:p>
             <w:pPr>
-              <w:keepNext/>
+              <w:keepNext w:val="false"/>
             </w:pPr>
             <w:r>
               <w:rPr>
@@ -13854,7 +13833,7 @@
           </w:tcPr>
           <w:p>
             <w:pPr>
-              <w:keepNext/>
+              <w:keepNext w:val="false"/>
             </w:pPr>
             <w:r>
               <w:rPr>
@@ -13883,7 +13862,7 @@
           </w:tcPr>
           <w:p>
             <w:pPr>
-              <w:keepNext/>
+              <w:keepNext w:val="false"/>
             </w:pPr>
             <w:r>
               <w:rPr>
@@ -13912,7 +13891,7 @@
           </w:tcPr>
           <w:p>
             <w:pPr>
-              <w:keepNext/>
+              <w:keepNext w:val="false"/>
             </w:pPr>
             <w:r>
               <w:rPr>
@@ -13941,7 +13920,7 @@
           </w:tcPr>
           <w:p>
             <w:pPr>
-              <w:keepNext/>
+              <w:keepNext w:val="false"/>
             </w:pPr>
             <w:r>
               <w:rPr>
@@ -13975,7 +13954,7 @@
           </w:tcPr>
           <w:p>
             <w:pPr>
-              <w:keepNext/>
+              <w:keepNext w:val="false"/>
             </w:pPr>
             <w:r>
               <w:rPr>
@@ -14004,7 +13983,7 @@
           </w:tcPr>
           <w:p>
             <w:pPr>
-              <w:keepNext/>
+              <w:keepNext w:val="false"/>
             </w:pPr>
             <w:r>
               <w:rPr>
@@ -14033,7 +14012,7 @@
           </w:tcPr>
           <w:p>
             <w:pPr>
-              <w:keepNext/>
+              <w:keepNext w:val="false"/>
             </w:pPr>
             <w:r>
               <w:rPr>
@@ -14062,7 +14041,7 @@
           </w:tcPr>
           <w:p>
             <w:pPr>
-              <w:keepNext/>
+              <w:keepNext w:val="false"/>
             </w:pPr>
             <w:r>
               <w:rPr>
@@ -14096,7 +14075,7 @@
           </w:tcPr>
           <w:p>
             <w:pPr>
-              <w:keepNext/>
+              <w:keepNext w:val="false"/>
             </w:pPr>
             <w:r>
               <w:rPr>
@@ -14125,7 +14104,7 @@
           </w:tcPr>
           <w:p>
             <w:pPr>
-              <w:keepNext/>
+              <w:keepNext w:val="false"/>
             </w:pPr>
             <w:r>
               <w:rPr>
@@ -14154,7 +14133,7 @@
           </w:tcPr>
           <w:p>
             <w:pPr>
-              <w:keepNext/>
+              <w:keepNext w:val="false"/>
             </w:pPr>
             <w:r>
               <w:rPr>
@@ -14183,7 +14162,7 @@
           </w:tcPr>
           <w:p>
             <w:pPr>
-              <w:keepNext/>
+              <w:keepNext w:val="false"/>
             </w:pPr>
             <w:r>
               <w:rPr>
@@ -14217,7 +14196,7 @@
           </w:tcPr>
           <w:p>
             <w:pPr>
-              <w:keepNext/>
+              <w:keepNext w:val="false"/>
             </w:pPr>
             <w:r>
               <w:rPr>
@@ -14246,7 +14225,7 @@
           </w:tcPr>
           <w:p>
             <w:pPr>
-              <w:keepNext/>
+              <w:keepNext w:val="false"/>
             </w:pPr>
             <w:r>
               <w:rPr>
@@ -14275,7 +14254,7 @@
           </w:tcPr>
           <w:p>
             <w:pPr>
-              <w:keepNext/>
+              <w:keepNext w:val="false"/>
             </w:pPr>
             <w:r>
               <w:rPr>
@@ -14304,7 +14283,7 @@
           </w:tcPr>
           <w:p>
             <w:pPr>
-              <w:keepNext/>
+              <w:keepNext w:val="false"/>
             </w:pPr>
             <w:r>
               <w:rPr>
@@ -14338,7 +14317,7 @@
           </w:tcPr>
           <w:p>
             <w:pPr>
-              <w:keepNext/>
+              <w:keepNext w:val="false"/>
             </w:pPr>
             <w:r>
               <w:rPr>
@@ -14367,7 +14346,7 @@
           </w:tcPr>
           <w:p>
             <w:pPr>
-              <w:keepNext/>
+              <w:keepNext w:val="false"/>
             </w:pPr>
             <w:r>
               <w:rPr>
@@ -14396,7 +14375,7 @@
           </w:tcPr>
           <w:p>
             <w:pPr>
-              <w:keepNext/>
+              <w:keepNext w:val="false"/>
             </w:pPr>
             <w:r>
               <w:rPr>
@@ -14425,7 +14404,7 @@
           </w:tcPr>
           <w:p>
             <w:pPr>
-              <w:keepNext/>
+              <w:keepNext w:val="false"/>
             </w:pPr>
             <w:r>
               <w:rPr>
@@ -14459,7 +14438,7 @@
           </w:tcPr>
           <w:p>
             <w:pPr>
-              <w:keepNext/>
+              <w:keepNext w:val="false"/>
             </w:pPr>
             <w:r>
               <w:rPr>
@@ -14488,7 +14467,7 @@
           </w:tcPr>
           <w:p>
             <w:pPr>
-              <w:keepNext/>
+              <w:keepNext w:val="false"/>
             </w:pPr>
             <w:r>
               <w:rPr>
@@ -14517,7 +14496,7 @@
           </w:tcPr>
           <w:p>
             <w:pPr>
-              <w:keepNext/>
+              <w:keepNext w:val="false"/>
             </w:pPr>
             <w:r>
               <w:rPr>
@@ -14546,7 +14525,7 @@
           </w:tcPr>
           <w:p>
             <w:pPr>
-              <w:keepNext/>
+              <w:keepNext w:val="false"/>
             </w:pPr>
             <w:r>
               <w:rPr>
@@ -14580,7 +14559,7 @@
           </w:tcPr>
           <w:p>
             <w:pPr>
-              <w:keepNext/>
+              <w:keepNext w:val="false"/>
             </w:pPr>
             <w:r>
               <w:rPr>
@@ -14609,7 +14588,7 @@
           </w:tcPr>
           <w:p>
             <w:pPr>
-              <w:keepNext/>
+              <w:keepNext w:val="false"/>
             </w:pPr>
             <w:r>
               <w:rPr>
@@ -14638,7 +14617,7 @@
           </w:tcPr>
           <w:p>
             <w:pPr>
-              <w:keepNext/>
+              <w:keepNext w:val="false"/>
             </w:pPr>
             <w:r>
               <w:rPr>
@@ -14667,7 +14646,7 @@
           </w:tcPr>
           <w:p>
             <w:pPr>
-              <w:keepNext/>
+              <w:keepNext w:val="false"/>
             </w:pPr>
             <w:r>
               <w:rPr>
@@ -14701,7 +14680,7 @@
           </w:tcPr>
           <w:p>
             <w:pPr>
-              <w:keepNext/>
+              <w:keepNext w:val="false"/>
             </w:pPr>
             <w:r>
               <w:rPr>
@@ -14730,7 +14709,7 @@
           </w:tcPr>
           <w:p>
             <w:pPr>
-              <w:keepNext/>
+              <w:keepNext w:val="false"/>
             </w:pPr>
             <w:r>
               <w:rPr>
@@ -14759,7 +14738,7 @@
           </w:tcPr>
           <w:p>
             <w:pPr>
-              <w:keepNext/>
+              <w:keepNext w:val="false"/>
             </w:pPr>
             <w:r>
               <w:rPr>
@@ -14788,7 +14767,7 @@
           </w:tcPr>
           <w:p>
             <w:pPr>
-              <w:keepNext/>
+              <w:keepNext w:val="false"/>
             </w:pPr>
             <w:r>
               <w:rPr>
@@ -14822,7 +14801,7 @@
           </w:tcPr>
           <w:p>
             <w:pPr>
-              <w:keepNext/>
+              <w:keepNext w:val="false"/>
             </w:pPr>
             <w:r>
               <w:rPr>
@@ -14851,7 +14830,7 @@
           </w:tcPr>
           <w:p>
             <w:pPr>
-              <w:keepNext/>
+              <w:keepNext w:val="false"/>
             </w:pPr>
             <w:r>
               <w:rPr>
@@ -14880,7 +14859,7 @@
           </w:tcPr>
           <w:p>
             <w:pPr>
-              <w:keepNext/>
+              <w:keepNext w:val="false"/>
             </w:pPr>
             <w:r>
               <w:rPr>
@@ -14909,7 +14888,7 @@
           </w:tcPr>
           <w:p>
             <w:pPr>
-              <w:keepNext/>
+              <w:keepNext w:val="false"/>
             </w:pPr>
             <w:r>
               <w:rPr>
@@ -14943,7 +14922,7 @@
           </w:tcPr>
           <w:p>
             <w:pPr>
-              <w:keepNext/>
+              <w:keepNext w:val="false"/>
             </w:pPr>
             <w:r>
               <w:rPr>
@@ -14972,7 +14951,7 @@
           </w:tcPr>
           <w:p>
             <w:pPr>
-              <w:keepNext/>
+              <w:keepNext w:val="false"/>
             </w:pPr>
             <w:r>
               <w:rPr>
@@ -15001,7 +14980,7 @@
           </w:tcPr>
           <w:p>
             <w:pPr>
-              <w:keepNext/>
+              <w:keepNext w:val="false"/>
             </w:pPr>
             <w:r>
               <w:rPr>
@@ -15030,7 +15009,7 @@
           </w:tcPr>
           <w:p>
             <w:pPr>
-              <w:keepNext/>
+              <w:keepNext w:val="false"/>
             </w:pPr>
             <w:r>
               <w:rPr>
@@ -15064,7 +15043,7 @@
           </w:tcPr>
           <w:p>
             <w:pPr>
-              <w:keepNext/>
+              <w:keepNext w:val="false"/>
             </w:pPr>
             <w:r>
               <w:rPr>
@@ -15093,7 +15072,7 @@
           </w:tcPr>
           <w:p>
             <w:pPr>
-              <w:keepNext/>
+              <w:keepNext w:val="false"/>
             </w:pPr>
             <w:r>
               <w:rPr>
@@ -15122,7 +15101,7 @@
           </w:tcPr>
           <w:p>
             <w:pPr>
-              <w:keepNext/>
+              <w:keepNext w:val="false"/>
             </w:pPr>
             <w:r>
               <w:rPr>
@@ -15151,7 +15130,7 @@
           </w:tcPr>
           <w:p>
             <w:pPr>
-              <w:keepNext/>
+              <w:keepNext w:val="false"/>
             </w:pPr>
             <w:r>
               <w:rPr>
@@ -15185,7 +15164,7 @@
           </w:tcPr>
           <w:p>
             <w:pPr>
-              <w:keepNext/>
+              <w:keepNext w:val="false"/>
             </w:pPr>
             <w:r>
               <w:rPr>
@@ -15214,7 +15193,7 @@
           </w:tcPr>
           <w:p>
             <w:pPr>
-              <w:keepNext/>
+              <w:keepNext w:val="false"/>
             </w:pPr>
             <w:r>
               <w:rPr>
@@ -15243,7 +15222,7 @@
           </w:tcPr>
           <w:p>
             <w:pPr>
-              <w:keepNext/>
+              <w:keepNext w:val="false"/>
             </w:pPr>
             <w:r>
               <w:rPr>
@@ -15272,7 +15251,7 @@
           </w:tcPr>
           <w:p>
             <w:pPr>
-              <w:keepNext/>
+              <w:keepNext w:val="false"/>
             </w:pPr>
             <w:r>
               <w:rPr>
@@ -15306,7 +15285,7 @@
           </w:tcPr>
           <w:p>
             <w:pPr>
-              <w:keepNext/>
+              <w:keepNext w:val="false"/>
             </w:pPr>
             <w:r>
               <w:rPr>
@@ -15335,7 +15314,7 @@
           </w:tcPr>
           <w:p>
             <w:pPr>
-              <w:keepNext/>
+              <w:keepNext w:val="false"/>
             </w:pPr>
             <w:r>
               <w:rPr>
@@ -15364,7 +15343,7 @@
           </w:tcPr>
           <w:p>
             <w:pPr>
-              <w:keepNext/>
+              <w:keepNext w:val="false"/>
             </w:pPr>
             <w:r>
               <w:rPr>
@@ -15393,7 +15372,7 @@
           </w:tcPr>
           <w:p>
             <w:pPr>
-              <w:keepNext/>
+              <w:keepNext w:val="false"/>
             </w:pPr>
             <w:r>
               <w:rPr>
@@ -15427,7 +15406,7 @@
           </w:tcPr>
           <w:p>
             <w:pPr>
-              <w:keepNext/>
+              <w:keepNext w:val="false"/>
             </w:pPr>
             <w:r>
               <w:rPr>
@@ -15456,7 +15435,7 @@
           </w:tcPr>
           <w:p>
             <w:pPr>
-              <w:keepNext/>
+              <w:keepNext w:val="false"/>
             </w:pPr>
             <w:r>
               <w:rPr>
@@ -15485,7 +15464,7 @@
           </w:tcPr>
           <w:p>
             <w:pPr>
-              <w:keepNext/>
+              <w:keepNext w:val="false"/>
             </w:pPr>
             <w:r>
               <w:rPr>
@@ -15514,7 +15493,7 @@
           </w:tcPr>
           <w:p>
             <w:pPr>
-              <w:keepNext/>
+              <w:keepNext w:val="false"/>
             </w:pPr>
             <w:r>
               <w:rPr>
@@ -15548,7 +15527,7 @@
           </w:tcPr>
           <w:p>
             <w:pPr>
-              <w:keepNext/>
+              <w:keepNext w:val="false"/>
             </w:pPr>
             <w:r>
               <w:rPr>
@@ -15577,7 +15556,7 @@
           </w:tcPr>
           <w:p>
             <w:pPr>
-              <w:keepNext/>
+              <w:keepNext w:val="false"/>
             </w:pPr>
             <w:r>
               <w:rPr>
@@ -15606,7 +15585,7 @@
           </w:tcPr>
           <w:p>
             <w:pPr>
-              <w:keepNext/>
+              <w:keepNext w:val="false"/>
             </w:pPr>
             <w:r>
               <w:rPr>
@@ -15635,7 +15614,7 @@
           </w:tcPr>
           <w:p>
             <w:pPr>
-              <w:keepNext/>
+              <w:keepNext w:val="false"/>
             </w:pPr>
             <w:r>
               <w:rPr>
@@ -15669,7 +15648,7 @@
           </w:tcPr>
           <w:p>
             <w:pPr>
-              <w:keepNext/>
+              <w:keepNext w:val="false"/>
             </w:pPr>
             <w:r>
               <w:rPr>
@@ -15698,7 +15677,7 @@
           </w:tcPr>
           <w:p>
             <w:pPr>
-              <w:keepNext/>
+              <w:keepNext w:val="false"/>
             </w:pPr>
             <w:r>
               <w:rPr>
@@ -15727,7 +15706,7 @@
           </w:tcPr>
           <w:p>
             <w:pPr>
-              <w:keepNext/>
+              <w:keepNext w:val="false"/>
             </w:pPr>
             <w:r>
               <w:rPr>
@@ -15756,7 +15735,7 @@
           </w:tcPr>
           <w:p>
             <w:pPr>
-              <w:keepNext/>
+              <w:keepNext w:val="false"/>
             </w:pPr>
             <w:r>
               <w:rPr>
@@ -15790,7 +15769,7 @@
           </w:tcPr>
           <w:p>
             <w:pPr>
-              <w:keepNext/>
+              <w:keepNext w:val="false"/>
             </w:pPr>
             <w:r>
               <w:rPr>
@@ -15819,7 +15798,7 @@
           </w:tcPr>
           <w:p>
             <w:pPr>
-              <w:keepNext/>
+              <w:keepNext w:val="false"/>
             </w:pPr>
             <w:r>
               <w:rPr>
@@ -15848,7 +15827,7 @@
           </w:tcPr>
           <w:p>
             <w:pPr>
-              <w:keepNext/>
+              <w:keepNext w:val="false"/>
             </w:pPr>
             <w:r>
               <w:rPr>
@@ -15877,7 +15856,7 @@
           </w:tcPr>
           <w:p>
             <w:pPr>
-              <w:keepNext/>
+              <w:keepNext w:val="false"/>
             </w:pPr>
             <w:r>
               <w:rPr>
@@ -15911,7 +15890,7 @@
           </w:tcPr>
           <w:p>
             <w:pPr>
-              <w:keepNext/>
+              <w:keepNext w:val="false"/>
             </w:pPr>
             <w:r>
               <w:rPr>
@@ -15940,7 +15919,7 @@
           </w:tcPr>
           <w:p>
             <w:pPr>
-              <w:keepNext/>
+              <w:keepNext w:val="false"/>
             </w:pPr>
             <w:r>
               <w:rPr>
@@ -15969,7 +15948,7 @@
           </w:tcPr>
           <w:p>
             <w:pPr>
-              <w:keepNext/>
+              <w:keepNext w:val="false"/>
             </w:pPr>
             <w:r>
               <w:rPr>
@@ -15998,7 +15977,7 @@
           </w:tcPr>
           <w:p>
             <w:pPr>
-              <w:keepNext/>
+              <w:keepNext w:val="false"/>
             </w:pPr>
             <w:r>
               <w:rPr>
@@ -16032,7 +16011,7 @@
           </w:tcPr>
           <w:p>
             <w:pPr>
-              <w:keepNext/>
+              <w:keepNext w:val="false"/>
             </w:pPr>
             <w:r>
               <w:rPr>
@@ -16061,7 +16040,7 @@
           </w:tcPr>
           <w:p>
             <w:pPr>
-              <w:keepNext/>
+              <w:keepNext w:val="false"/>
             </w:pPr>
             <w:r>
               <w:rPr>
@@ -16090,7 +16069,7 @@
           </w:tcPr>
           <w:p>
             <w:pPr>
-              <w:keepNext/>
+              <w:keepNext w:val="false"/>
             </w:pPr>
             <w:r>
               <w:rPr>
@@ -16119,7 +16098,7 @@
           </w:tcPr>
           <w:p>
             <w:pPr>
-              <w:keepNext/>
+              <w:keepNext w:val="false"/>
             </w:pPr>
             <w:r>
               <w:rPr>
@@ -16153,7 +16132,7 @@
           </w:tcPr>
           <w:p>
             <w:pPr>
-              <w:keepNext/>
+              <w:keepNext w:val="false"/>
             </w:pPr>
             <w:r>
               <w:rPr>
@@ -16182,7 +16161,7 @@
           </w:tcPr>
           <w:p>
             <w:pPr>
-              <w:keepNext/>
+              <w:keepNext w:val="false"/>
             </w:pPr>
             <w:r>
               <w:rPr>
@@ -16211,7 +16190,7 @@
           </w:tcPr>
           <w:p>
             <w:pPr>
-              <w:keepNext/>
+              <w:keepNext w:val="false"/>
             </w:pPr>
             <w:r>
               <w:rPr>
@@ -16240,7 +16219,7 @@
           </w:tcPr>
           <w:p>
             <w:pPr>
-              <w:keepNext/>
+              <w:keepNext w:val="false"/>
             </w:pPr>
             <w:r>
               <w:rPr>
@@ -16409,7 +16388,6 @@
         <w:pStyle w:val="Heading2"/>
         <w:keepNext/>
         <w:keepLines/>
-        <w:pageBreakBefore/>
       </w:pPr>
       <w:r>
         <w:t xml:space="preserve">Crescimento implícito: cálculo separado</w:t>
@@ -17670,7 +17648,7 @@
         <w:pStyle w:val="Heading1"/>
         <w:keepNext/>
         <w:keepLines/>
-        <w:pageBreakBefore/>
+        <w:spacing w:before="360"/>
       </w:pPr>
       <w:r>
         <w:t xml:space="preserve">9. Cobertura</w:t>
@@ -23402,13 +23380,12 @@
     </w:p>
     <w:p>
       <w:pPr>
-        <w:pStyle w:val="Heading1"/>
+        <w:pStyle w:val="Heading2"/>
         <w:keepNext/>
         <w:keepLines/>
-        <w:spacing w:before="360"/>
       </w:pPr>
       <w:r>
-        <w:t xml:space="preserve">10. Próximo passo</w:t>
+        <w:t xml:space="preserve">Próximo passo</w:t>
       </w:r>
     </w:p>
     <w:p>
@@ -23417,7 +23394,7 @@
         <w:jc w:val="both"/>
       </w:pPr>
       <w:r>
-        <w:t xml:space="preserve">Com a aprovação, este documento vira a versão 1.0.4 da metodologia. Depois vem a etapa 3 do motor: padronização no setor, notas dos pilares e Score mensal de 2007 a hoje, ainda sem o teste de desempenho.</w:t>
+        <w:t xml:space="preserve">Etapa 3 do motor: padronização no setor, notas dos pilares e Score mensal de 2007 a hoje, ainda sem o teste de desempenho.</w:t>
       </w:r>
     </w:p>
     <w:sectPr>
@@ -23608,7 +23585,7 @@
         <w:sz w:val="17"/>
         <w:szCs w:val="17"/>
       </w:rPr>
-      <w:t xml:space="preserve">	Especificação operacional — proposta v1.0.4</w:t>
+      <w:t xml:space="preserve">	Especificação operacional v1.0.4</w:t>
     </w:r>
   </w:p>
 </w:hdr>

</xml_diff>

<commit_message>
Score Exponencial — documentos v1.0.4 (metodologia e especificação aprovadas), com paginação conferida
Co-Authored-By: Claude Opus 5.5 <noreply@anthropic.com>
Claude-Session: https://claude.ai/code/session_01HefRF4fGJRzRQKWSK6E8Hc
</commit_message>
<xml_diff>
--- a/docs/Score_Exponencial_especificacao_v1.0.4.docx
+++ b/docs/Score_Exponencial_especificacao_v1.0.4.docx
@@ -3857,6 +3857,7 @@
         <w:pStyle w:val="Heading3"/>
         <w:keepNext/>
         <w:keepLines/>
+        <w:pageBreakBefore/>
       </w:pPr>
       <w:r>
         <w:t xml:space="preserve">6. Volume (giro)</w:t>
@@ -3991,7 +3992,7 @@
         <w:pStyle w:val="Heading1"/>
         <w:keepNext/>
         <w:keepLines/>
-        <w:pageBreakBefore/>
+        <w:spacing w:before="360"/>
       </w:pPr>
       <w:r>
         <w:t xml:space="preserve">4. Pilar 2 — Qualidade e valor</w:t>
@@ -5007,6 +5008,7 @@
         <w:pStyle w:val="Heading3"/>
         <w:keepNext/>
         <w:keepLines/>
+        <w:pageBreakBefore/>
       </w:pPr>
       <w:r>
         <w:t xml:space="preserve">9. Qualidade ampla (QMJ simplificado)</w:t>
@@ -6137,7 +6139,7 @@
         <w:pStyle w:val="Heading1"/>
         <w:keepNext/>
         <w:keepLines/>
-        <w:pageBreakBefore/>
+        <w:spacing w:before="360"/>
       </w:pPr>
       <w:r>
         <w:t xml:space="preserve">5. Pilar 3 — Momento fundamental</w:t>
@@ -7075,6 +7077,7 @@
         <w:pStyle w:val="Heading3"/>
         <w:keepNext/>
         <w:keepLines/>
+        <w:pageBreakBefore/>
       </w:pPr>
       <w:r>
         <w:t xml:space="preserve">16. Alavancagem operacional (Lev; Thiagarajan)</w:t>
@@ -7209,7 +7212,7 @@
         <w:pStyle w:val="Heading1"/>
         <w:keepNext/>
         <w:keepLines/>
-        <w:pageBreakBefore/>
+        <w:spacing w:before="360"/>
       </w:pPr>
       <w:r>
         <w:t xml:space="preserve">6. Pilar 4 — Risco e confluência</w:t>
@@ -8034,6 +8037,7 @@
         <w:pStyle w:val="Heading3"/>
         <w:keepNext/>
         <w:keepLines/>
+        <w:pageBreakBefore/>
       </w:pPr>
       <w:r>
         <w:t xml:space="preserve">22. Indício de manipulação (escore M de Beneish)</w:t>
@@ -17648,6 +17652,7 @@
         <w:pStyle w:val="Heading1"/>
         <w:keepNext/>
         <w:keepLines/>
+        <w:pageBreakBefore/>
         <w:spacing w:before="360"/>
       </w:pPr>
       <w:r>
@@ -23376,25 +23381,6 @@
       </w:r>
       <w:r>
         <w:t xml:space="preserve"> a dívida do EV e da segurança usa só empréstimos e financiamentos; arrendamentos (IFRS 16) ficam de fora.</w:t>
-      </w:r>
-    </w:p>
-    <w:p>
-      <w:pPr>
-        <w:pStyle w:val="Heading2"/>
-        <w:keepNext/>
-        <w:keepLines/>
-      </w:pPr>
-      <w:r>
-        <w:t xml:space="preserve">Próximo passo</w:t>
-      </w:r>
-    </w:p>
-    <w:p>
-      <w:pPr>
-        <w:spacing w:after="120" w:line="300"/>
-        <w:jc w:val="both"/>
-      </w:pPr>
-      <w:r>
-        <w:t xml:space="preserve">Etapa 3 do motor: padronização no setor, notas dos pilares e Score mensal de 2007 a hoje, ainda sem o teste de desempenho.</w:t>
       </w:r>
     </w:p>
     <w:sectPr>

</xml_diff>